<commit_message>
Hermes Agent Phase 2 (Gedaechtnis) abgeschlossen + Repo-Backup
- Hermes-Setup-Doku: Phase 2 als DONE markiert (Agent-Shared mit 10
  thematischen Notizen gefuellt, AGENTS.md-Auto-Load- + On-Demand-GATE
  bestanden); .docx neu erzeugt. Der Vault selbst liegt separat unter
  C:\Users\manyw\HermesBrain (nicht in diesem Repo).
- HERMES_SETUP.md: Provider-Empfehlung auf ChatGPT/Codex-OAuth (GPT-5.5)
  umgestellt (Opus 4.8 spaeter als Orchestrator-Profil).
- CLAUDE.md: Dashboard-Build-Tooling-Block um RSS-Voll-Scan-Pass 2026-06-14
  ergaenzt (vorbestehende Working-Tree-Aenderung).
- .claude/settings.local.json: lokale Permission-Allowlist (Backup).

Co-Authored-By: Claude Opus 4.8 (1M context) <noreply@anthropic.com>
</commit_message>
<xml_diff>
--- a/Hermes/HERMES_SETUP.docx
+++ b/Hermes/HERMES_SETUP.docx
@@ -2109,7 +2109,7 @@
           <w:i/>
           <w:color w:val="555555"/>
         </w:rPr>
-        <w:t>Empfehlung für dich:</w:t>
+        <w:t>Empfehlung für dich (Stand 15.6.2026):</w:t>
       </w:r>
       <w:r>
         <w:rPr>
@@ -2124,14 +2124,29 @@
           <w:i/>
           <w:color w:val="555555"/>
         </w:rPr>
-        <w:t>Anthropic/Opus 4.8</w:t>
+        <w:t>ChatGPT/Codex-OAuth (GPT-5.5)</w:t>
       </w:r>
       <w:r>
         <w:rPr>
           <w:i/>
           <w:color w:val="555555"/>
         </w:rPr>
-        <w:t xml:space="preserve"> starten (du nutzt Claude bereits); Nous Portal als Option, falls du die gebündelten Content-Tools willst.</w:t>
+        <w:t xml:space="preserve"> starten — glatter OAuth-Pfad, ChatGPT-Plus-Abo vorhanden; Anthropic-OAuth ist (noch) die raue Ecke (siehe Warnblock). </w:t>
+      </w:r>
+      <w:r>
+        <w:rPr>
+          <w:b/>
+          <w:i/>
+          <w:color w:val="555555"/>
+        </w:rPr>
+        <w:t>Opus 4.8 später als zweites Profil (Orchestrator/„Gehirn")</w:t>
+      </w:r>
+      <w:r>
+        <w:rPr>
+          <w:i/>
+          <w:color w:val="555555"/>
+        </w:rPr>
+        <w:t>, sobald der Agent-SDK-Credit geclaimt + verifiziert ist — ein low-volume-Orchestrator passt gut in die $100/Mo-Deckelung (Max 5x). Nous Portal als Option für gebündelte Content-Tools.</w:t>
       </w:r>
     </w:p>
     <w:p>

</xml_diff>